<commit_message>
Merge & upload files
</commit_message>
<xml_diff>
--- a/PBL REPORT TEMPLATE.docx
+++ b/PBL REPORT TEMPLATE.docx
@@ -1,10 +1,14 @@
 
 <file path=word/document.xml><?xml version="1.0" encoding="utf-8"?>
-<w:document xmlns:wpc="http://schemas.microsoft.com/office/word/2010/wordprocessingCanvas" xmlns:cx="http://schemas.microsoft.com/office/drawing/2014/chartex" xmlns:cx1="http://schemas.microsoft.com/office/drawing/2015/9/8/chartex" xmlns:cx2="http://schemas.microsoft.com/office/drawing/2015/10/21/chartex" xmlns:cx3="http://schemas.microsoft.com/office/drawing/2016/5/9/chartex" xmlns:cx4="http://schemas.microsoft.com/office/drawing/2016/5/10/chartex" xmlns:cx5="http://schemas.microsoft.com/office/drawing/2016/5/11/chartex" xmlns:cx6="http://schemas.microsoft.com/office/drawing/2016/5/12/chartex" xmlns:cx7="http://schemas.microsoft.com/office/drawing/2016/5/13/chartex" xmlns:cx8="http://schemas.microsoft.com/office/drawing/2016/5/14/chartex" xmlns:mc="http://schemas.openxmlformats.org/markup-compatibility/2006" xmlns:aink="http://schemas.microsoft.com/office/drawing/2016/ink" xmlns:am3d="http://schemas.microsoft.com/office/drawing/2017/model3d" xmlns:o="urn:schemas-microsoft-com:office:office" xmlns:oel="http://schemas.microsoft.com/office/2019/extlst" xmlns:r="http://schemas.openxmlformats.org/officeDocument/2006/relationships" xmlns:m="http://schemas.openxmlformats.org/officeDocument/2006/math" xmlns:v="urn:schemas-microsoft-com:vml" xmlns:wp14="http://schemas.microsoft.com/office/word/2010/wordprocessingDrawing" xmlns:wp="http://schemas.openxmlformats.org/drawingml/2006/wordprocessingDrawing" xmlns:w10="urn:schemas-microsoft-com:office:word" xmlns:w="http://schemas.openxmlformats.org/wordprocessingml/2006/main" xmlns:w14="http://schemas.microsoft.com/office/word/2010/wordml" xmlns:w15="http://schemas.microsoft.com/office/word/2012/wordml" xmlns:w16cex="http://schemas.microsoft.com/office/word/2018/wordml/cex" xmlns:w16cid="http://schemas.microsoft.com/office/word/2016/wordml/cid" xmlns:w16="http://schemas.microsoft.com/office/word/2018/wordml" xmlns:w16du="http://schemas.microsoft.com/office/word/2023/wordml/word16du" xmlns:w16sdtdh="http://schemas.microsoft.com/office/word/2020/wordml/sdtdatahash" xmlns:w16sdtfl="http://schemas.microsoft.com/office/word/2024/wordml/sdtformatlock" xmlns:w16se="http://schemas.microsoft.com/office/word/2015/wordml/symex" xmlns:wpg="http://schemas.microsoft.com/office/word/2010/wordprocessingGroup" xmlns:wpi="http://schemas.microsoft.com/office/word/2010/wordprocessingInk" xmlns:wne="http://schemas.microsoft.com/office/word/2006/wordml" xmlns:wps="http://schemas.microsoft.com/office/word/2010/wordprocessingShape" mc:Ignorable="w14 w15 w16se w16cid w16 w16cex w16sdtdh w16sdtfl w16du wp14">
+<w:document xmlns:wpc="http://schemas.microsoft.com/office/word/2010/wordprocessingCanvas" xmlns:cx="http://schemas.microsoft.com/office/drawing/2014/chartex" xmlns:cx1="http://schemas.microsoft.com/office/drawing/2015/9/8/chartex" xmlns:cx2="http://schemas.microsoft.com/office/drawing/2015/10/21/chartex" xmlns:cx3="http://schemas.microsoft.com/office/drawing/2016/5/9/chartex" xmlns:cx4="http://schemas.microsoft.com/office/drawing/2016/5/10/chartex" xmlns:cx5="http://schemas.microsoft.com/office/drawing/2016/5/11/chartex" xmlns:cx6="http://schemas.microsoft.com/office/drawing/2016/5/12/chartex" xmlns:cx7="http://schemas.microsoft.com/office/drawing/2016/5/13/chartex" xmlns:cx8="http://schemas.microsoft.com/office/drawing/2016/5/14/chartex" xmlns:mc="http://schemas.openxmlformats.org/markup-compatibility/2006" xmlns:aink="http://schemas.microsoft.com/office/drawing/2016/ink" xmlns:am3d="http://schemas.microsoft.com/office/drawing/2017/model3d" xmlns:o="urn:schemas-microsoft-com:office:office" xmlns:oel="http://schemas.microsoft.com/office/2019/extlst" xmlns:r="http://schemas.openxmlformats.org/officeDocument/2006/relationships" xmlns:m="http://schemas.openxmlformats.org/officeDocument/2006/math" xmlns:v="urn:schemas-microsoft-com:vml" xmlns:wp14="http://schemas.microsoft.com/office/word/2010/wordprocessingDrawing" xmlns:wp="http://schemas.openxmlformats.org/drawingml/2006/wordprocessingDrawing" xmlns:w10="urn:schemas-microsoft-com:office:word" xmlns:w="http://schemas.openxmlformats.org/wordprocessingml/2006/main" xmlns:w14="http://schemas.microsoft.com/office/word/2010/wordml" xmlns:w15="http://schemas.microsoft.com/office/word/2012/wordml" xmlns:w16cex="http://schemas.microsoft.com/office/word/2018/wordml/cex" xmlns:w16cid="http://schemas.microsoft.com/office/word/2016/wordml/cid" xmlns:w16="http://schemas.microsoft.com/office/word/2018/wordml" xmlns:w16du="http://schemas.microsoft.com/office/word/2023/wordml/word16du" xmlns:w16sdtdh="http://schemas.microsoft.com/office/word/2020/wordml/sdtdatahash" xmlns:w16se="http://schemas.microsoft.com/office/word/2015/wordml/symex" xmlns:wpg="http://schemas.microsoft.com/office/word/2010/wordprocessingGroup" xmlns:wpi="http://schemas.microsoft.com/office/word/2010/wordprocessingInk" xmlns:wne="http://schemas.microsoft.com/office/word/2006/wordml" xmlns:wps="http://schemas.microsoft.com/office/word/2010/wordprocessingShape" mc:Ignorable="w14 w15 w16se w16cid w16 w16cex w16sdtdh w16du wp14">
   <w:body>
     <w:p/>
     <w:p/>
-    <w:p/>
+    <w:p>
+      <w:pPr>
+        <w:jc w:val="center"/>
+      </w:pPr>
+    </w:p>
     <w:p>
       <w:pPr>
         <w:jc w:val="center"/>
@@ -75,8 +79,16 @@
         <w:t xml:space="preserve"> Semester</w:t>
       </w:r>
     </w:p>
-    <w:p/>
-    <w:p/>
+    <w:p>
+      <w:pPr>
+        <w:jc w:val="center"/>
+      </w:pPr>
+    </w:p>
+    <w:p>
+      <w:pPr>
+        <w:jc w:val="center"/>
+      </w:pPr>
+    </w:p>
     <w:p>
       <w:pPr>
         <w:jc w:val="center"/>
@@ -231,7 +243,6 @@
         </w:rPr>
       </w:pPr>
       <w:proofErr w:type="spellStart"/>
-      <w:proofErr w:type="gramStart"/>
       <w:r>
         <w:rPr>
           <w:rFonts w:ascii="Cambria" w:hAnsi="Cambria" w:cstheme="minorHAnsi"/>
@@ -255,7 +266,7 @@
           <w:szCs w:val="40"/>
           <w:lang w:val="en-US"/>
         </w:rPr>
-        <w:t xml:space="preserve">  </w:t>
+        <w:t xml:space="preserve">: </w:t>
       </w:r>
       <w:r>
         <w:rPr>
@@ -267,9 +278,8 @@
           <w:szCs w:val="40"/>
           <w:lang w:val="en-US"/>
         </w:rPr>
-        <w:t>An</w:t>
-      </w:r>
-      <w:proofErr w:type="gramEnd"/>
+        <w:t>An Algorithmic Trading Platfor</w:t>
+      </w:r>
       <w:r>
         <w:rPr>
           <w:rFonts w:ascii="Cambria" w:hAnsi="Cambria" w:cstheme="minorHAnsi"/>
@@ -280,7 +290,7 @@
           <w:szCs w:val="40"/>
           <w:lang w:val="en-US"/>
         </w:rPr>
-        <w:t xml:space="preserve"> Algorithmic Trading Platform</w:t>
+        <w:t>m</w:t>
       </w:r>
     </w:p>
     <w:p>
@@ -295,7 +305,10 @@
           <w:szCs w:val="40"/>
         </w:rPr>
       </w:pPr>
-      <w:r>
+    </w:p>
+    <w:p>
+      <w:pPr>
+        <w:jc w:val="center"/>
         <w:rPr>
           <w:rFonts w:ascii="Cambria" w:hAnsi="Cambria" w:cstheme="minorHAnsi"/>
           <w:b/>
@@ -304,8 +317,7 @@
           <w:sz w:val="40"/>
           <w:szCs w:val="40"/>
         </w:rPr>
-        <w:t xml:space="preserve"> </w:t>
-      </w:r>
+      </w:pPr>
     </w:p>
     <w:p>
       <w:pPr>
@@ -315,10 +327,65 @@
           <w:b/>
           <w:bCs/>
           <w:color w:val="FF0000"/>
-          <w:sz w:val="40"/>
-          <w:szCs w:val="40"/>
-        </w:rPr>
-      </w:pPr>
+          <w:sz w:val="32"/>
+          <w:szCs w:val="32"/>
+        </w:rPr>
+      </w:pPr>
+      <w:r>
+        <w:rPr>
+          <w:rFonts w:ascii="Cambria" w:hAnsi="Cambria" w:cstheme="minorHAnsi"/>
+          <w:b/>
+          <w:bCs/>
+          <w:color w:val="FF0000"/>
+          <w:sz w:val="32"/>
+          <w:szCs w:val="32"/>
+        </w:rPr>
+        <w:t>V. Rohan</w:t>
+      </w:r>
+      <w:r>
+        <w:rPr>
+          <w:rFonts w:ascii="Cambria" w:hAnsi="Cambria" w:cstheme="minorHAnsi"/>
+          <w:b/>
+          <w:bCs/>
+          <w:color w:val="FF0000"/>
+          <w:sz w:val="32"/>
+          <w:szCs w:val="32"/>
+        </w:rPr>
+        <w:t> </w:t>
+      </w:r>
+      <w:r>
+        <w:rPr>
+          <w:rFonts w:ascii="Cambria" w:hAnsi="Cambria" w:cstheme="minorHAnsi"/>
+          <w:b/>
+          <w:bCs/>
+          <w:color w:val="FF0000"/>
+          <w:sz w:val="32"/>
+          <w:szCs w:val="32"/>
+        </w:rPr>
+        <w:t> </w:t>
+      </w:r>
+      <w:r>
+        <w:rPr>
+          <w:rFonts w:ascii="Cambria" w:hAnsi="Cambria" w:cstheme="minorHAnsi"/>
+          <w:b/>
+          <w:bCs/>
+          <w:color w:val="FF0000"/>
+          <w:sz w:val="32"/>
+          <w:szCs w:val="32"/>
+        </w:rPr>
+        <w:t> </w:t>
+      </w:r>
+      <w:r>
+        <w:rPr>
+          <w:rFonts w:ascii="Cambria" w:hAnsi="Cambria" w:cstheme="minorHAnsi"/>
+          <w:b/>
+          <w:bCs/>
+          <w:color w:val="FF0000"/>
+          <w:sz w:val="32"/>
+          <w:szCs w:val="32"/>
+        </w:rPr>
+        <w:t>2520030558</w:t>
+      </w:r>
     </w:p>
     <w:p>
       <w:pPr>
@@ -328,32 +395,20 @@
           <w:b/>
           <w:bCs/>
           <w:color w:val="FF0000"/>
-          <w:sz w:val="40"/>
-          <w:szCs w:val="40"/>
-        </w:rPr>
-      </w:pPr>
-    </w:p>
-    <w:p>
-      <w:pPr>
-        <w:rPr>
-          <w:rFonts w:ascii="Cambria" w:hAnsi="Cambria" w:cstheme="minorHAnsi"/>
-          <w:b/>
-          <w:bCs/>
-          <w:color w:val="FF0000"/>
-          <w:sz w:val="32"/>
-          <w:szCs w:val="32"/>
-        </w:rPr>
-      </w:pPr>
-      <w:r>
-        <w:rPr>
-          <w:rFonts w:ascii="Cambria" w:hAnsi="Cambria" w:cstheme="minorHAnsi"/>
-          <w:b/>
-          <w:bCs/>
-          <w:color w:val="FF0000"/>
-          <w:sz w:val="32"/>
-          <w:szCs w:val="32"/>
-        </w:rPr>
-        <w:t>V. Rohan</w:t>
+          <w:sz w:val="32"/>
+          <w:szCs w:val="32"/>
+        </w:rPr>
+      </w:pPr>
+      <w:r>
+        <w:rPr>
+          <w:rFonts w:ascii="Cambria" w:hAnsi="Cambria" w:cstheme="minorHAnsi"/>
+          <w:b/>
+          <w:bCs/>
+          <w:color w:val="FF0000"/>
+          <w:sz w:val="32"/>
+          <w:szCs w:val="32"/>
+        </w:rPr>
+        <w:t>J. Sai Satyan</w:t>
       </w:r>
       <w:r>
         <w:rPr>
@@ -375,6 +430,52 @@
           <w:sz w:val="32"/>
           <w:szCs w:val="32"/>
         </w:rPr>
+        <w:t xml:space="preserve">  </w:t>
+      </w:r>
+      <w:r>
+        <w:rPr>
+          <w:rFonts w:ascii="Cambria" w:hAnsi="Cambria" w:cstheme="minorHAnsi"/>
+          <w:b/>
+          <w:bCs/>
+          <w:color w:val="FF0000"/>
+          <w:sz w:val="32"/>
+          <w:szCs w:val="32"/>
+        </w:rPr>
+        <w:t>2520030088</w:t>
+      </w:r>
+    </w:p>
+    <w:p>
+      <w:pPr>
+        <w:jc w:val="center"/>
+        <w:rPr>
+          <w:rFonts w:ascii="Cambria" w:hAnsi="Cambria" w:cstheme="minorHAnsi"/>
+          <w:b/>
+          <w:bCs/>
+          <w:color w:val="FF0000"/>
+          <w:sz w:val="32"/>
+          <w:szCs w:val="32"/>
+        </w:rPr>
+      </w:pPr>
+      <w:r>
+        <w:rPr>
+          <w:rFonts w:ascii="Cambria" w:hAnsi="Cambria" w:cstheme="minorHAnsi"/>
+          <w:b/>
+          <w:bCs/>
+          <w:color w:val="FF0000"/>
+          <w:sz w:val="32"/>
+          <w:szCs w:val="32"/>
+        </w:rPr>
+        <w:t>K. Shankar</w:t>
+      </w:r>
+      <w:r>
+        <w:rPr>
+          <w:rFonts w:ascii="Cambria" w:hAnsi="Cambria" w:cstheme="minorHAnsi"/>
+          <w:b/>
+          <w:bCs/>
+          <w:color w:val="FF0000"/>
+          <w:sz w:val="32"/>
+          <w:szCs w:val="32"/>
+        </w:rPr>
         <w:t> </w:t>
       </w:r>
       <w:r>
@@ -397,135 +498,25 @@
           <w:sz w:val="32"/>
           <w:szCs w:val="32"/>
         </w:rPr>
-        <w:t>2520030558</w:t>
-      </w:r>
-    </w:p>
-    <w:p>
-      <w:pPr>
-        <w:rPr>
-          <w:rFonts w:ascii="Cambria" w:hAnsi="Cambria" w:cstheme="minorHAnsi"/>
-          <w:b/>
-          <w:bCs/>
-          <w:color w:val="FF0000"/>
-          <w:sz w:val="32"/>
-          <w:szCs w:val="32"/>
-        </w:rPr>
-      </w:pPr>
-      <w:r>
-        <w:rPr>
-          <w:rFonts w:ascii="Cambria" w:hAnsi="Cambria" w:cstheme="minorHAnsi"/>
-          <w:b/>
-          <w:bCs/>
-          <w:color w:val="FF0000"/>
-          <w:sz w:val="32"/>
-          <w:szCs w:val="32"/>
-        </w:rPr>
-        <w:t>J. Sai Satyan</w:t>
-      </w:r>
-      <w:r>
-        <w:rPr>
-          <w:rFonts w:ascii="Cambria" w:hAnsi="Cambria" w:cstheme="minorHAnsi"/>
-          <w:b/>
-          <w:bCs/>
-          <w:color w:val="FF0000"/>
-          <w:sz w:val="32"/>
-          <w:szCs w:val="32"/>
-        </w:rPr>
-        <w:t> </w:t>
-      </w:r>
-      <w:r>
-        <w:rPr>
-          <w:rFonts w:ascii="Cambria" w:hAnsi="Cambria" w:cstheme="minorHAnsi"/>
-          <w:b/>
-          <w:bCs/>
-          <w:color w:val="FF0000"/>
-          <w:sz w:val="32"/>
-          <w:szCs w:val="32"/>
-        </w:rPr>
-        <w:t xml:space="preserve">  </w:t>
-      </w:r>
-      <w:r>
-        <w:rPr>
-          <w:rFonts w:ascii="Cambria" w:hAnsi="Cambria" w:cstheme="minorHAnsi"/>
-          <w:b/>
-          <w:bCs/>
-          <w:color w:val="FF0000"/>
-          <w:sz w:val="32"/>
-          <w:szCs w:val="32"/>
-        </w:rPr>
-        <w:t>2520030088</w:t>
-      </w:r>
-    </w:p>
-    <w:p>
-      <w:pPr>
-        <w:rPr>
-          <w:rFonts w:ascii="Cambria" w:hAnsi="Cambria" w:cstheme="minorHAnsi"/>
-          <w:b/>
-          <w:bCs/>
-          <w:color w:val="FF0000"/>
-          <w:sz w:val="32"/>
-          <w:szCs w:val="32"/>
-        </w:rPr>
-      </w:pPr>
-      <w:r>
-        <w:rPr>
-          <w:rFonts w:ascii="Cambria" w:hAnsi="Cambria" w:cstheme="minorHAnsi"/>
-          <w:b/>
-          <w:bCs/>
-          <w:color w:val="FF0000"/>
-          <w:sz w:val="32"/>
-          <w:szCs w:val="32"/>
-        </w:rPr>
-        <w:t>K. Shankar</w:t>
-      </w:r>
-      <w:r>
-        <w:rPr>
-          <w:rFonts w:ascii="Cambria" w:hAnsi="Cambria" w:cstheme="minorHAnsi"/>
-          <w:b/>
-          <w:bCs/>
-          <w:color w:val="FF0000"/>
-          <w:sz w:val="32"/>
-          <w:szCs w:val="32"/>
-        </w:rPr>
-        <w:t> </w:t>
-      </w:r>
-      <w:r>
-        <w:rPr>
-          <w:rFonts w:ascii="Cambria" w:hAnsi="Cambria" w:cstheme="minorHAnsi"/>
-          <w:b/>
-          <w:bCs/>
-          <w:color w:val="FF0000"/>
-          <w:sz w:val="32"/>
-          <w:szCs w:val="32"/>
-        </w:rPr>
-        <w:t> </w:t>
-      </w:r>
-      <w:r>
-        <w:rPr>
-          <w:rFonts w:ascii="Cambria" w:hAnsi="Cambria" w:cstheme="minorHAnsi"/>
-          <w:b/>
-          <w:bCs/>
-          <w:color w:val="FF0000"/>
-          <w:sz w:val="32"/>
-          <w:szCs w:val="32"/>
-        </w:rPr>
         <w:t>2520030063</w:t>
       </w:r>
     </w:p>
     <w:p>
       <w:pPr>
-        <w:rPr>
-          <w:rFonts w:ascii="Cambria" w:hAnsi="Cambria" w:cstheme="minorHAnsi"/>
-          <w:b/>
-          <w:bCs/>
-          <w:color w:val="FF0000"/>
-          <w:sz w:val="32"/>
-          <w:szCs w:val="32"/>
-        </w:rPr>
-      </w:pPr>
-    </w:p>
-    <w:p>
-      <w:pPr>
+        <w:jc w:val="center"/>
+        <w:rPr>
+          <w:rFonts w:ascii="Cambria" w:hAnsi="Cambria" w:cstheme="minorHAnsi"/>
+          <w:b/>
+          <w:bCs/>
+          <w:color w:val="FF0000"/>
+          <w:sz w:val="32"/>
+          <w:szCs w:val="32"/>
+        </w:rPr>
+      </w:pPr>
+    </w:p>
+    <w:p>
+      <w:pPr>
+        <w:jc w:val="center"/>
         <w:rPr>
           <w:rFonts w:ascii="Cambria" w:hAnsi="Cambria" w:cstheme="minorHAnsi"/>
           <w:b/>
@@ -1009,7 +1000,6 @@
         <w:t xml:space="preserve">This module is used to search for stock tickers and financial </w:t>
       </w:r>
       <w:proofErr w:type="spellStart"/>
-      <w:proofErr w:type="gramStart"/>
       <w:r>
         <w:rPr>
           <w:rFonts w:ascii="Cambria" w:hAnsi="Cambria" w:cstheme="minorHAnsi"/>
@@ -1021,7 +1011,6 @@
         <w:t>news.For</w:t>
       </w:r>
       <w:proofErr w:type="spellEnd"/>
-      <w:proofErr w:type="gramEnd"/>
       <w:r>
         <w:rPr>
           <w:rFonts w:ascii="Cambria" w:hAnsi="Cambria" w:cstheme="minorHAnsi"/>
@@ -1050,7 +1039,7 @@
           <w:sz w:val="32"/>
           <w:szCs w:val="32"/>
         </w:rPr>
-        <w:t>We use KMP, Z-Algorithm, and Aho-</w:t>
+        <w:t xml:space="preserve">We use KMP, Z-Algorithm, and </w:t>
       </w:r>
       <w:proofErr w:type="spellStart"/>
       <w:r>
@@ -1061,7 +1050,7 @@
           <w:sz w:val="32"/>
           <w:szCs w:val="32"/>
         </w:rPr>
-        <w:t>Corasick</w:t>
+        <w:t>Aho-Corasick</w:t>
       </w:r>
       <w:proofErr w:type="spellEnd"/>
       <w:r>
@@ -1285,7 +1274,6 @@
         <w:t xml:space="preserve">We use Dynamic Programming to find the best possible trading </w:t>
       </w:r>
       <w:proofErr w:type="spellStart"/>
-      <w:proofErr w:type="gramStart"/>
       <w:r>
         <w:rPr>
           <w:rFonts w:ascii="Cambria" w:hAnsi="Cambria" w:cstheme="minorHAnsi"/>
@@ -1297,7 +1285,6 @@
         <w:t>sequence.For</w:t>
       </w:r>
       <w:proofErr w:type="spellEnd"/>
-      <w:proofErr w:type="gramEnd"/>
       <w:r>
         <w:rPr>
           <w:rFonts w:ascii="Cambria" w:hAnsi="Cambria" w:cstheme="minorHAnsi"/>
@@ -1351,7 +1338,6 @@
         <w:t xml:space="preserve">This module decides how orders can be routed across different trading </w:t>
       </w:r>
       <w:proofErr w:type="spellStart"/>
-      <w:proofErr w:type="gramStart"/>
       <w:r>
         <w:rPr>
           <w:rFonts w:ascii="Cambria" w:hAnsi="Cambria" w:cstheme="minorHAnsi"/>
@@ -1363,7 +1349,6 @@
         <w:t>venues.For</w:t>
       </w:r>
       <w:proofErr w:type="spellEnd"/>
-      <w:proofErr w:type="gramEnd"/>
       <w:r>
         <w:rPr>
           <w:rFonts w:ascii="Cambria" w:hAnsi="Cambria" w:cstheme="minorHAnsi"/>
@@ -1375,7 +1360,6 @@
         <w:t xml:space="preserve"> example, if different exchanges have different prices and available quantities, the system can find a suitable routing </w:t>
       </w:r>
       <w:proofErr w:type="spellStart"/>
-      <w:proofErr w:type="gramStart"/>
       <w:r>
         <w:rPr>
           <w:rFonts w:ascii="Cambria" w:hAnsi="Cambria" w:cstheme="minorHAnsi"/>
@@ -1387,7 +1371,6 @@
         <w:t>plan.We</w:t>
       </w:r>
       <w:proofErr w:type="spellEnd"/>
-      <w:proofErr w:type="gramEnd"/>
       <w:r>
         <w:rPr>
           <w:rFonts w:ascii="Cambria" w:hAnsi="Cambria" w:cstheme="minorHAnsi"/>
@@ -1441,7 +1424,6 @@
         <w:t xml:space="preserve">This module selects assets while staying within a given </w:t>
       </w:r>
       <w:proofErr w:type="spellStart"/>
-      <w:proofErr w:type="gramStart"/>
       <w:r>
         <w:rPr>
           <w:rFonts w:ascii="Cambria" w:hAnsi="Cambria" w:cstheme="minorHAnsi"/>
@@ -1453,7 +1435,6 @@
         <w:t>budget.For</w:t>
       </w:r>
       <w:proofErr w:type="spellEnd"/>
-      <w:proofErr w:type="gramEnd"/>
       <w:r>
         <w:rPr>
           <w:rFonts w:ascii="Cambria" w:hAnsi="Cambria" w:cstheme="minorHAnsi"/>
@@ -1465,7 +1446,6 @@
         <w:t xml:space="preserve"> example, if the available budget is ₹10,000, the system selects suitable assets without exceeding the </w:t>
       </w:r>
       <w:proofErr w:type="spellStart"/>
-      <w:proofErr w:type="gramStart"/>
       <w:r>
         <w:rPr>
           <w:rFonts w:ascii="Cambria" w:hAnsi="Cambria" w:cstheme="minorHAnsi"/>
@@ -1477,7 +1457,6 @@
         <w:t>budget.This</w:t>
       </w:r>
       <w:proofErr w:type="spellEnd"/>
-      <w:proofErr w:type="gramEnd"/>
       <w:r>
         <w:rPr>
           <w:rFonts w:ascii="Cambria" w:hAnsi="Cambria" w:cstheme="minorHAnsi"/>
@@ -1531,7 +1510,6 @@
         <w:t xml:space="preserve">This module estimates the possible risk in </w:t>
       </w:r>
       <w:proofErr w:type="spellStart"/>
-      <w:proofErr w:type="gramStart"/>
       <w:r>
         <w:rPr>
           <w:rFonts w:ascii="Cambria" w:hAnsi="Cambria" w:cstheme="minorHAnsi"/>
@@ -1543,7 +1521,6 @@
         <w:t>trading.We</w:t>
       </w:r>
       <w:proofErr w:type="spellEnd"/>
-      <w:proofErr w:type="gramEnd"/>
       <w:r>
         <w:rPr>
           <w:rFonts w:ascii="Cambria" w:hAnsi="Cambria" w:cstheme="minorHAnsi"/>
@@ -1555,7 +1532,6 @@
         <w:t xml:space="preserve"> use Monte Carlo simulation to create different possible situations and estimate the </w:t>
       </w:r>
       <w:proofErr w:type="spellStart"/>
-      <w:proofErr w:type="gramStart"/>
       <w:r>
         <w:rPr>
           <w:rFonts w:ascii="Cambria" w:hAnsi="Cambria" w:cstheme="minorHAnsi"/>
@@ -1567,7 +1543,6 @@
         <w:t>risk.It</w:t>
       </w:r>
       <w:proofErr w:type="spellEnd"/>
-      <w:proofErr w:type="gramEnd"/>
       <w:r>
         <w:rPr>
           <w:rFonts w:ascii="Cambria" w:hAnsi="Cambria" w:cstheme="minorHAnsi"/>
@@ -1601,7 +1576,6 @@
         <w:t xml:space="preserve">) simulation and reservoir </w:t>
       </w:r>
       <w:proofErr w:type="spellStart"/>
-      <w:proofErr w:type="gramStart"/>
       <w:r>
         <w:rPr>
           <w:rFonts w:ascii="Cambria" w:hAnsi="Cambria" w:cstheme="minorHAnsi"/>
@@ -1613,7 +1587,6 @@
         <w:t>sampling.Overall</w:t>
       </w:r>
       <w:proofErr w:type="spellEnd"/>
-      <w:proofErr w:type="gramEnd"/>
       <w:r>
         <w:rPr>
           <w:rFonts w:ascii="Cambria" w:hAnsi="Cambria" w:cstheme="minorHAnsi"/>
@@ -2071,7 +2044,7 @@
 </file>
 
 <file path=word/numbering.xml><?xml version="1.0" encoding="utf-8"?>
-<w:numbering xmlns:wpc="http://schemas.microsoft.com/office/word/2010/wordprocessingCanvas" xmlns:cx="http://schemas.microsoft.com/office/drawing/2014/chartex" xmlns:cx1="http://schemas.microsoft.com/office/drawing/2015/9/8/chartex" xmlns:cx2="http://schemas.microsoft.com/office/drawing/2015/10/21/chartex" xmlns:cx3="http://schemas.microsoft.com/office/drawing/2016/5/9/chartex" xmlns:cx4="http://schemas.microsoft.com/office/drawing/2016/5/10/chartex" xmlns:cx5="http://schemas.microsoft.com/office/drawing/2016/5/11/chartex" xmlns:cx6="http://schemas.microsoft.com/office/drawing/2016/5/12/chartex" xmlns:cx7="http://schemas.microsoft.com/office/drawing/2016/5/13/chartex" xmlns:cx8="http://schemas.microsoft.com/office/drawing/2016/5/14/chartex" xmlns:mc="http://schemas.openxmlformats.org/markup-compatibility/2006" xmlns:aink="http://schemas.microsoft.com/office/drawing/2016/ink" xmlns:am3d="http://schemas.microsoft.com/office/drawing/2017/model3d" xmlns:o="urn:schemas-microsoft-com:office:office" xmlns:oel="http://schemas.microsoft.com/office/2019/extlst" xmlns:r="http://schemas.openxmlformats.org/officeDocument/2006/relationships" xmlns:m="http://schemas.openxmlformats.org/officeDocument/2006/math" xmlns:v="urn:schemas-microsoft-com:vml" xmlns:wp14="http://schemas.microsoft.com/office/word/2010/wordprocessingDrawing" xmlns:wp="http://schemas.openxmlformats.org/drawingml/2006/wordprocessingDrawing" xmlns:w10="urn:schemas-microsoft-com:office:word" xmlns:w="http://schemas.openxmlformats.org/wordprocessingml/2006/main" xmlns:w14="http://schemas.microsoft.com/office/word/2010/wordml" xmlns:w15="http://schemas.microsoft.com/office/word/2012/wordml" xmlns:w16cex="http://schemas.microsoft.com/office/word/2018/wordml/cex" xmlns:w16cid="http://schemas.microsoft.com/office/word/2016/wordml/cid" xmlns:w16="http://schemas.microsoft.com/office/word/2018/wordml" xmlns:w16du="http://schemas.microsoft.com/office/word/2023/wordml/word16du" xmlns:w16sdtdh="http://schemas.microsoft.com/office/word/2020/wordml/sdtdatahash" xmlns:w16sdtfl="http://schemas.microsoft.com/office/word/2024/wordml/sdtformatlock" xmlns:w16se="http://schemas.microsoft.com/office/word/2015/wordml/symex" xmlns:wpg="http://schemas.microsoft.com/office/word/2010/wordprocessingGroup" xmlns:wpi="http://schemas.microsoft.com/office/word/2010/wordprocessingInk" xmlns:wne="http://schemas.microsoft.com/office/word/2006/wordml" xmlns:wps="http://schemas.microsoft.com/office/word/2010/wordprocessingShape" mc:Ignorable="w14 w15 w16se w16cid w16 w16cex w16sdtdh w16sdtfl w16du wp14">
+<w:numbering xmlns:wpc="http://schemas.microsoft.com/office/word/2010/wordprocessingCanvas" xmlns:cx="http://schemas.microsoft.com/office/drawing/2014/chartex" xmlns:cx1="http://schemas.microsoft.com/office/drawing/2015/9/8/chartex" xmlns:cx2="http://schemas.microsoft.com/office/drawing/2015/10/21/chartex" xmlns:cx3="http://schemas.microsoft.com/office/drawing/2016/5/9/chartex" xmlns:cx4="http://schemas.microsoft.com/office/drawing/2016/5/10/chartex" xmlns:cx5="http://schemas.microsoft.com/office/drawing/2016/5/11/chartex" xmlns:cx6="http://schemas.microsoft.com/office/drawing/2016/5/12/chartex" xmlns:cx7="http://schemas.microsoft.com/office/drawing/2016/5/13/chartex" xmlns:cx8="http://schemas.microsoft.com/office/drawing/2016/5/14/chartex" xmlns:mc="http://schemas.openxmlformats.org/markup-compatibility/2006" xmlns:aink="http://schemas.microsoft.com/office/drawing/2016/ink" xmlns:am3d="http://schemas.microsoft.com/office/drawing/2017/model3d" xmlns:o="urn:schemas-microsoft-com:office:office" xmlns:oel="http://schemas.microsoft.com/office/2019/extlst" xmlns:r="http://schemas.openxmlformats.org/officeDocument/2006/relationships" xmlns:m="http://schemas.openxmlformats.org/officeDocument/2006/math" xmlns:v="urn:schemas-microsoft-com:vml" xmlns:wp14="http://schemas.microsoft.com/office/word/2010/wordprocessingDrawing" xmlns:wp="http://schemas.openxmlformats.org/drawingml/2006/wordprocessingDrawing" xmlns:w10="urn:schemas-microsoft-com:office:word" xmlns:w="http://schemas.openxmlformats.org/wordprocessingml/2006/main" xmlns:w14="http://schemas.microsoft.com/office/word/2010/wordml" xmlns:w15="http://schemas.microsoft.com/office/word/2012/wordml" xmlns:w16cex="http://schemas.microsoft.com/office/word/2018/wordml/cex" xmlns:w16cid="http://schemas.microsoft.com/office/word/2016/wordml/cid" xmlns:w16="http://schemas.microsoft.com/office/word/2018/wordml" xmlns:w16du="http://schemas.microsoft.com/office/word/2023/wordml/word16du" xmlns:w16sdtdh="http://schemas.microsoft.com/office/word/2020/wordml/sdtdatahash" xmlns:w16se="http://schemas.microsoft.com/office/word/2015/wordml/symex" xmlns:wpg="http://schemas.microsoft.com/office/word/2010/wordprocessingGroup" xmlns:wpi="http://schemas.microsoft.com/office/word/2010/wordprocessingInk" xmlns:wne="http://schemas.microsoft.com/office/word/2006/wordml" xmlns:wps="http://schemas.microsoft.com/office/word/2010/wordprocessingShape" mc:Ignorable="w14 w15 w16se w16cid w16 w16cex w16sdtdh w16du wp14">
   <w:abstractNum w:abstractNumId="0" w15:restartNumberingAfterBreak="0">
     <w:nsid w:val="1C76029D"/>
     <w:multiLevelType w:val="multilevel"/>
@@ -3524,7 +3497,7 @@
 </file>
 
 <file path=word/styles.xml><?xml version="1.0" encoding="utf-8"?>
-<w:styles xmlns:mc="http://schemas.openxmlformats.org/markup-compatibility/2006" xmlns:r="http://schemas.openxmlformats.org/officeDocument/2006/relationships" xmlns:w="http://schemas.openxmlformats.org/wordprocessingml/2006/main" xmlns:w14="http://schemas.microsoft.com/office/word/2010/wordml" xmlns:w15="http://schemas.microsoft.com/office/word/2012/wordml" xmlns:w16cex="http://schemas.microsoft.com/office/word/2018/wordml/cex" xmlns:w16cid="http://schemas.microsoft.com/office/word/2016/wordml/cid" xmlns:w16="http://schemas.microsoft.com/office/word/2018/wordml" xmlns:w16du="http://schemas.microsoft.com/office/word/2023/wordml/word16du" xmlns:w16sdtdh="http://schemas.microsoft.com/office/word/2020/wordml/sdtdatahash" xmlns:w16sdtfl="http://schemas.microsoft.com/office/word/2024/wordml/sdtformatlock" xmlns:w16se="http://schemas.microsoft.com/office/word/2015/wordml/symex" mc:Ignorable="w14 w15 w16se w16cid w16 w16cex w16sdtdh w16sdtfl w16du">
+<w:styles xmlns:mc="http://schemas.openxmlformats.org/markup-compatibility/2006" xmlns:r="http://schemas.openxmlformats.org/officeDocument/2006/relationships" xmlns:w="http://schemas.openxmlformats.org/wordprocessingml/2006/main" xmlns:w14="http://schemas.microsoft.com/office/word/2010/wordml" xmlns:w15="http://schemas.microsoft.com/office/word/2012/wordml" xmlns:w16cex="http://schemas.microsoft.com/office/word/2018/wordml/cex" xmlns:w16cid="http://schemas.microsoft.com/office/word/2016/wordml/cid" xmlns:w16="http://schemas.microsoft.com/office/word/2018/wordml" xmlns:w16du="http://schemas.microsoft.com/office/word/2023/wordml/word16du" xmlns:w16sdtdh="http://schemas.microsoft.com/office/word/2020/wordml/sdtdatahash" xmlns:w16se="http://schemas.microsoft.com/office/word/2015/wordml/symex" mc:Ignorable="w14 w15 w16se w16cid w16 w16cex w16sdtdh w16du">
   <w:docDefaults>
     <w:rPrDefault>
       <w:rPr>
@@ -3925,6 +3898,7 @@
   <w:style w:type="character" w:default="1" w:styleId="DefaultParagraphFont">
     <w:name w:val="Default Paragraph Font"/>
     <w:uiPriority w:val="1"/>
+    <w:semiHidden/>
     <w:unhideWhenUsed/>
   </w:style>
   <w:style w:type="table" w:default="1" w:styleId="TableNormal">

</xml_diff>